<commit_message>
fixed typo and added country to response
</commit_message>
<xml_diff>
--- a/03_Team_Work/Team5/Milestone_4_Interfaces_and_Data_Structures/IC_Done/WT_M4_Team5_API_1.12.1_USPSAddressValidation.docx
+++ b/03_Team_Work/Team5/Milestone_4_Interfaces_and_Data_Structures/IC_Done/WT_M4_Team5_API_1.12.1_USPSAddressValidation.docx
@@ -10,16 +10,7 @@
         <w:t>1.</w:t>
       </w:r>
       <w:r>
-        <w:t>1</w:t>
-      </w:r>
-      <w:r>
-        <w:t>2.1</w:t>
-      </w:r>
-      <w:r>
-        <w:t xml:space="preserve"> – API</w:t>
-      </w:r>
-      <w:r>
-        <w:t xml:space="preserve"> AddressValidationRequest</w:t>
+        <w:t>12.1 – API AddressValidationRequest</w:t>
       </w:r>
     </w:p>
     <w:tbl>
@@ -630,7 +621,23 @@
                 <w:sz w:val="22"/>
                 <w:lang w:eastAsia="en-US"/>
               </w:rPr>
-              <w:t>counrty</w:t>
+              <w:t>coun</w:t>
+            </w:r>
+            <w:r>
+              <w:rPr>
+                <w:rFonts w:ascii="Arial" w:eastAsia="Times New Roman" w:hAnsi="Arial" w:cs="Arial"/>
+                <w:sz w:val="22"/>
+                <w:lang w:eastAsia="en-US"/>
+              </w:rPr>
+              <w:t>tr</w:t>
+            </w:r>
+            <w:r>
+              <w:rPr>
+                <w:rFonts w:ascii="Arial" w:eastAsia="Times New Roman" w:hAnsi="Arial" w:cs="Arial"/>
+                <w:sz w:val="22"/>
+                <w:lang w:eastAsia="en-US"/>
+              </w:rPr>
+              <w:t>y</w:t>
             </w:r>
           </w:p>
         </w:tc>
@@ -1114,15 +1121,7 @@
                 <w:sz w:val="22"/>
                 <w:lang w:eastAsia="en-US"/>
               </w:rPr>
-              <w:t>USPS-standardized</w:t>
-            </w:r>
-            <w:r>
-              <w:rPr>
-                <w:rFonts w:ascii="Arial" w:eastAsia="Times New Roman" w:hAnsi="Arial" w:cs="Arial"/>
-                <w:sz w:val="22"/>
-                <w:lang w:eastAsia="en-US"/>
-              </w:rPr>
-              <w:t xml:space="preserve"> apt number</w:t>
+              <w:t>USPS-standardized apt number</w:t>
             </w:r>
           </w:p>
         </w:tc>
@@ -1313,15 +1312,7 @@
                 <w:sz w:val="22"/>
                 <w:lang w:eastAsia="en-US"/>
               </w:rPr>
-              <w:t>USPS-standardized</w:t>
-            </w:r>
-            <w:r>
-              <w:rPr>
-                <w:rFonts w:ascii="Arial" w:eastAsia="Times New Roman" w:hAnsi="Arial" w:cs="Arial"/>
-                <w:sz w:val="22"/>
-                <w:lang w:eastAsia="en-US"/>
-              </w:rPr>
-              <w:t xml:space="preserve"> state</w:t>
+              <w:t>USPS-standardized state</w:t>
             </w:r>
           </w:p>
         </w:tc>
@@ -1415,15 +1406,7 @@
                 <w:sz w:val="22"/>
                 <w:lang w:eastAsia="en-US"/>
               </w:rPr>
-              <w:t>USPS-standardized</w:t>
-            </w:r>
-            <w:r>
-              <w:rPr>
-                <w:rFonts w:ascii="Arial" w:eastAsia="Times New Roman" w:hAnsi="Arial" w:cs="Arial"/>
-                <w:sz w:val="22"/>
-                <w:lang w:eastAsia="en-US"/>
-              </w:rPr>
-              <w:t xml:space="preserve"> ZIP code</w:t>
+              <w:t>USPS-standardized ZIP code</w:t>
             </w:r>
           </w:p>
         </w:tc>
@@ -1451,6 +1434,100 @@
                 <w:sz w:val="22"/>
                 <w:lang w:eastAsia="en-US"/>
               </w:rPr>
+              <w:t>country</w:t>
+            </w:r>
+          </w:p>
+        </w:tc>
+        <w:tc>
+          <w:tcPr>
+            <w:tcW w:w="0" w:type="auto"/>
+          </w:tcPr>
+          <w:p>
+            <w:pPr>
+              <w:cnfStyle w:val="000000100000" w:firstRow="0" w:lastRow="0" w:firstColumn="0" w:lastColumn="0" w:oddVBand="0" w:evenVBand="0" w:oddHBand="1" w:evenHBand="0" w:firstRowFirstColumn="0" w:firstRowLastColumn="0" w:lastRowFirstColumn="0" w:lastRowLastColumn="0"/>
+              <w:rPr>
+                <w:rFonts w:ascii="Arial" w:eastAsia="Times New Roman" w:hAnsi="Arial" w:cs="Arial"/>
+                <w:sz w:val="22"/>
+                <w:lang w:eastAsia="en-US"/>
+              </w:rPr>
+            </w:pPr>
+            <w:r>
+              <w:rPr>
+                <w:rFonts w:ascii="Arial" w:eastAsia="Times New Roman" w:hAnsi="Arial" w:cs="Arial"/>
+                <w:sz w:val="22"/>
+                <w:lang w:eastAsia="en-US"/>
+              </w:rPr>
+              <w:t>String</w:t>
+            </w:r>
+          </w:p>
+        </w:tc>
+        <w:tc>
+          <w:tcPr>
+            <w:tcW w:w="0" w:type="auto"/>
+          </w:tcPr>
+          <w:p>
+            <w:pPr>
+              <w:cnfStyle w:val="000000100000" w:firstRow="0" w:lastRow="0" w:firstColumn="0" w:lastColumn="0" w:oddVBand="0" w:evenVBand="0" w:oddHBand="1" w:evenHBand="0" w:firstRowFirstColumn="0" w:firstRowLastColumn="0" w:lastRowFirstColumn="0" w:lastRowLastColumn="0"/>
+              <w:rPr>
+                <w:rFonts w:ascii="Arial" w:eastAsia="Times New Roman" w:hAnsi="Arial" w:cs="Arial"/>
+                <w:sz w:val="22"/>
+                <w:lang w:eastAsia="en-US"/>
+              </w:rPr>
+            </w:pPr>
+            <w:r>
+              <w:rPr>
+                <w:rFonts w:ascii="Arial" w:eastAsia="Times New Roman" w:hAnsi="Arial" w:cs="Arial"/>
+                <w:sz w:val="22"/>
+                <w:lang w:eastAsia="en-US"/>
+              </w:rPr>
+              <w:t>Yes</w:t>
+            </w:r>
+          </w:p>
+        </w:tc>
+        <w:tc>
+          <w:tcPr>
+            <w:tcW w:w="0" w:type="auto"/>
+          </w:tcPr>
+          <w:p>
+            <w:pPr>
+              <w:cnfStyle w:val="000000100000" w:firstRow="0" w:lastRow="0" w:firstColumn="0" w:lastColumn="0" w:oddVBand="0" w:evenVBand="0" w:oddHBand="1" w:evenHBand="0" w:firstRowFirstColumn="0" w:firstRowLastColumn="0" w:lastRowFirstColumn="0" w:lastRowLastColumn="0"/>
+              <w:rPr>
+                <w:rFonts w:ascii="Arial" w:eastAsia="Times New Roman" w:hAnsi="Arial" w:cs="Arial"/>
+                <w:sz w:val="22"/>
+                <w:lang w:eastAsia="en-US"/>
+              </w:rPr>
+            </w:pPr>
+            <w:r>
+              <w:rPr>
+                <w:rFonts w:ascii="Arial" w:eastAsia="Times New Roman" w:hAnsi="Arial" w:cs="Arial"/>
+                <w:sz w:val="22"/>
+                <w:lang w:eastAsia="en-US"/>
+              </w:rPr>
+              <w:t>USPS-standardized country</w:t>
+            </w:r>
+          </w:p>
+        </w:tc>
+      </w:tr>
+      <w:tr>
+        <w:tc>
+          <w:tcPr>
+            <w:cnfStyle w:val="001000000000" w:firstRow="0" w:lastRow="0" w:firstColumn="1" w:lastColumn="0" w:oddVBand="0" w:evenVBand="0" w:oddHBand="0" w:evenHBand="0" w:firstRowFirstColumn="0" w:firstRowLastColumn="0" w:lastRowFirstColumn="0" w:lastRowLastColumn="0"/>
+            <w:tcW w:w="0" w:type="auto"/>
+          </w:tcPr>
+          <w:p>
+            <w:pPr>
+              <w:rPr>
+                <w:rFonts w:ascii="Arial" w:eastAsia="Times New Roman" w:hAnsi="Arial" w:cs="Arial"/>
+                <w:sz w:val="22"/>
+                <w:lang w:eastAsia="en-US"/>
+              </w:rPr>
+            </w:pPr>
+            <w:r>
+              <w:rPr>
+                <w:rFonts w:ascii="Arial" w:eastAsia="Times New Roman" w:hAnsi="Arial" w:cs="Arial"/>
+                <w:sz w:val="22"/>
+                <w:lang w:eastAsia="en-US"/>
+              </w:rPr>
               <w:t>message</w:t>
             </w:r>
           </w:p>
@@ -1461,7 +1538,7 @@
           </w:tcPr>
           <w:p>
             <w:pPr>
-              <w:cnfStyle w:val="000000100000" w:firstRow="0" w:lastRow="0" w:firstColumn="0" w:lastColumn="0" w:oddVBand="0" w:evenVBand="0" w:oddHBand="1" w:evenHBand="0" w:firstRowFirstColumn="0" w:firstRowLastColumn="0" w:lastRowFirstColumn="0" w:lastRowLastColumn="0"/>
+              <w:cnfStyle w:val="000000000000" w:firstRow="0" w:lastRow="0" w:firstColumn="0" w:lastColumn="0" w:oddVBand="0" w:evenVBand="0" w:oddHBand="0" w:evenHBand="0" w:firstRowFirstColumn="0" w:firstRowLastColumn="0" w:lastRowFirstColumn="0" w:lastRowLastColumn="0"/>
               <w:rPr>
                 <w:rFonts w:ascii="Arial" w:eastAsia="Times New Roman" w:hAnsi="Arial" w:cs="Arial"/>
                 <w:sz w:val="22"/>
@@ -1484,7 +1561,7 @@
           </w:tcPr>
           <w:p>
             <w:pPr>
-              <w:cnfStyle w:val="000000100000" w:firstRow="0" w:lastRow="0" w:firstColumn="0" w:lastColumn="0" w:oddVBand="0" w:evenVBand="0" w:oddHBand="1" w:evenHBand="0" w:firstRowFirstColumn="0" w:firstRowLastColumn="0" w:lastRowFirstColumn="0" w:lastRowLastColumn="0"/>
+              <w:cnfStyle w:val="000000000000" w:firstRow="0" w:lastRow="0" w:firstColumn="0" w:lastColumn="0" w:oddVBand="0" w:evenVBand="0" w:oddHBand="0" w:evenHBand="0" w:firstRowFirstColumn="0" w:firstRowLastColumn="0" w:lastRowFirstColumn="0" w:lastRowLastColumn="0"/>
               <w:rPr>
                 <w:rFonts w:ascii="Arial" w:eastAsia="Times New Roman" w:hAnsi="Arial" w:cs="Arial"/>
                 <w:sz w:val="22"/>
@@ -1507,7 +1584,7 @@
           </w:tcPr>
           <w:p>
             <w:pPr>
-              <w:cnfStyle w:val="000000100000" w:firstRow="0" w:lastRow="0" w:firstColumn="0" w:lastColumn="0" w:oddVBand="0" w:evenVBand="0" w:oddHBand="1" w:evenHBand="0" w:firstRowFirstColumn="0" w:firstRowLastColumn="0" w:lastRowFirstColumn="0" w:lastRowLastColumn="0"/>
+              <w:cnfStyle w:val="000000000000" w:firstRow="0" w:lastRow="0" w:firstColumn="0" w:lastColumn="0" w:oddVBand="0" w:evenVBand="0" w:oddHBand="0" w:evenHBand="0" w:firstRowFirstColumn="0" w:firstRowLastColumn="0" w:lastRowFirstColumn="0" w:lastRowLastColumn="0"/>
               <w:rPr>
                 <w:rFonts w:ascii="Arial" w:eastAsia="Times New Roman" w:hAnsi="Arial" w:cs="Arial"/>
                 <w:sz w:val="22"/>
@@ -2150,6 +2227,7 @@
   <w:style w:type="character" w:default="1" w:styleId="DefaultParagraphFont">
     <w:name w:val="Default Paragraph Font"/>
     <w:uiPriority w:val="1"/>
+    <w:semiHidden/>
     <w:unhideWhenUsed/>
   </w:style>
   <w:style w:type="table" w:default="1" w:styleId="TableNormal">
@@ -2907,6 +2985,23 @@
 </file>
 
 <file path=customXml/item1.xml><?xml version="1.0" encoding="utf-8"?>
+<p:properties xmlns:p="http://schemas.microsoft.com/office/2006/metadata/properties" xmlns:xsi="http://www.w3.org/2001/XMLSchema-instance" xmlns:pc="http://schemas.microsoft.com/office/infopath/2007/PartnerControls">
+  <documentManagement>
+    <_activity xmlns="e1754db9-3fca-472f-b275-6b389ceae582" xsi:nil="true"/>
+  </documentManagement>
+</p:properties>
+</file>
+
+<file path=customXml/item2.xml><?xml version="1.0" encoding="utf-8"?>
+<?mso-contentType ?>
+<FormTemplates xmlns="http://schemas.microsoft.com/sharepoint/v3/contenttype/forms">
+  <Display>DocumentLibraryForm</Display>
+  <Edit>DocumentLibraryForm</Edit>
+  <New>DocumentLibraryForm</New>
+</FormTemplates>
+</file>
+
+<file path=customXml/item3.xml><?xml version="1.0" encoding="utf-8"?>
 <ct:contentTypeSchema xmlns:ct="http://schemas.microsoft.com/office/2006/metadata/contentType" xmlns:ma="http://schemas.microsoft.com/office/2006/metadata/properties/metaAttributes" ct:_="" ma:_="" ma:contentTypeName="Document" ma:contentTypeID="0x0101002743E756C27EFC438A486A093D670437" ma:contentTypeVersion="13" ma:contentTypeDescription="Create a new document." ma:contentTypeScope="" ma:versionID="759892d3dbedc0441e0a21cf348ece64">
   <xsd:schema xmlns:xsd="http://www.w3.org/2001/XMLSchema" xmlns:xs="http://www.w3.org/2001/XMLSchema" xmlns:p="http://schemas.microsoft.com/office/2006/metadata/properties" xmlns:ns3="e1754db9-3fca-472f-b275-6b389ceae582" xmlns:ns4="a0a5f3eb-f9b6-4c3b-b52d-338ad68e4ddb" targetNamespace="http://schemas.microsoft.com/office/2006/metadata/properties" ma:root="true" ma:fieldsID="24ba95ce80aa8c1ceb7a3bb483b49455" ns3:_="" ns4:_="">
     <xsd:import namespace="e1754db9-3fca-472f-b275-6b389ceae582"/>
@@ -3127,24 +3222,25 @@
 </ct:contentTypeSchema>
 </file>
 
-<file path=customXml/item2.xml><?xml version="1.0" encoding="utf-8"?>
-<?mso-contentType ?>
-<FormTemplates xmlns="http://schemas.microsoft.com/sharepoint/v3/contenttype/forms">
-  <Display>DocumentLibraryForm</Display>
-  <Edit>DocumentLibraryForm</Edit>
-  <New>DocumentLibraryForm</New>
-</FormTemplates>
+<file path=customXml/itemProps1.xml><?xml version="1.0" encoding="utf-8"?>
+<ds:datastoreItem xmlns:ds="http://schemas.openxmlformats.org/officeDocument/2006/customXml" ds:itemID="{9404C01C-86C6-4D0A-B441-E14BF8988DDF}">
+  <ds:schemaRefs>
+    <ds:schemaRef ds:uri="http://schemas.microsoft.com/office/2006/metadata/properties"/>
+    <ds:schemaRef ds:uri="http://schemas.microsoft.com/office/infopath/2007/PartnerControls"/>
+    <ds:schemaRef ds:uri="e1754db9-3fca-472f-b275-6b389ceae582"/>
+  </ds:schemaRefs>
+</ds:datastoreItem>
 </file>
 
-<file path=customXml/item3.xml><?xml version="1.0" encoding="utf-8"?>
-<p:properties xmlns:p="http://schemas.microsoft.com/office/2006/metadata/properties" xmlns:xsi="http://www.w3.org/2001/XMLSchema-instance" xmlns:pc="http://schemas.microsoft.com/office/infopath/2007/PartnerControls">
-  <documentManagement>
-    <_activity xmlns="e1754db9-3fca-472f-b275-6b389ceae582" xsi:nil="true"/>
-  </documentManagement>
-</p:properties>
+<file path=customXml/itemProps2.xml><?xml version="1.0" encoding="utf-8"?>
+<ds:datastoreItem xmlns:ds="http://schemas.openxmlformats.org/officeDocument/2006/customXml" ds:itemID="{B5876D69-44ED-44F1-A0D9-8675C97823E1}">
+  <ds:schemaRefs>
+    <ds:schemaRef ds:uri="http://schemas.microsoft.com/sharepoint/v3/contenttype/forms"/>
+  </ds:schemaRefs>
+</ds:datastoreItem>
 </file>
 
-<file path=customXml/itemProps1.xml><?xml version="1.0" encoding="utf-8"?>
+<file path=customXml/itemProps3.xml><?xml version="1.0" encoding="utf-8"?>
 <ds:datastoreItem xmlns:ds="http://schemas.openxmlformats.org/officeDocument/2006/customXml" ds:itemID="{F25B2825-15D5-4754-92A7-DA9DC1095F99}">
   <ds:schemaRefs>
     <ds:schemaRef ds:uri="http://schemas.microsoft.com/office/2006/metadata/contentType"/>
@@ -3161,22 +3257,4 @@
     <ds:schemaRef ds:uri="http://schemas.microsoft.com/internal/obd"/>
   </ds:schemaRefs>
 </ds:datastoreItem>
-</file>
-
-<file path=customXml/itemProps2.xml><?xml version="1.0" encoding="utf-8"?>
-<ds:datastoreItem xmlns:ds="http://schemas.openxmlformats.org/officeDocument/2006/customXml" ds:itemID="{B5876D69-44ED-44F1-A0D9-8675C97823E1}">
-  <ds:schemaRefs>
-    <ds:schemaRef ds:uri="http://schemas.microsoft.com/sharepoint/v3/contenttype/forms"/>
-  </ds:schemaRefs>
-</ds:datastoreItem>
-</file>
-
-<file path=customXml/itemProps3.xml><?xml version="1.0" encoding="utf-8"?>
-<ds:datastoreItem xmlns:ds="http://schemas.openxmlformats.org/officeDocument/2006/customXml" ds:itemID="{9404C01C-86C6-4D0A-B441-E14BF8988DDF}">
-  <ds:schemaRefs>
-    <ds:schemaRef ds:uri="http://schemas.microsoft.com/office/2006/metadata/properties"/>
-    <ds:schemaRef ds:uri="http://schemas.microsoft.com/office/infopath/2007/PartnerControls"/>
-    <ds:schemaRef ds:uri="e1754db9-3fca-472f-b275-6b389ceae582"/>
-  </ds:schemaRefs>
-</ds:datastoreItem>
 </file>
</xml_diff>